<commit_message>
7.1 und 7.3 verbessert
</commit_message>
<xml_diff>
--- a/Blatt7/Abgabe/HLRA_Blatt7_Abgabe.docx
+++ b/Blatt7/Abgabe/HLRA_Blatt7_Abgabe.docx
@@ -362,7 +362,7 @@
         <w:rPr>
           <w:rtl w:val="0"/>
         </w:rPr>
-        <w:t xml:space="preserve">Durch die zusätzliche Parallelisierung mit TBB konnte ein Gesamtspeedup von ca. 9.3 erreicht werden. Theoretisch wäre bei perfekter Auslastung aller 16 logischen Kerne (bei 8 physischen Kernen mit Hyperthreading) ein Speedup von bis zu 16 möglich. Die gemessenen ca. 9.3 deuten darauf hin, dass die Last gut verteilt wird, aber einige Faktoren wie Overhead und Speicherbandbreite eine vollständige Ausnutzung verhindern.</w:t>
+        <w:t xml:space="preserve">Durch die zusätzliche Parallelisierung mit TBB konnte ein Gesamtspeedup von ca. 9.3 erreicht werden. Theoretisch wäre bei perfekter Auslastung aller 4 Threads ein Speedup von bis zu 16 (zusammen mit SIMD) möglich. Die gemessenen ca. 9.3 deuten darauf hin, dass die Last gut verteilt wird, aber einige Faktoren wie Overhead und Speicherbandbreite eine vollständige Ausnutzung verhindern.</w:t>
       </w:r>
     </w:p>
     <w:p>
@@ -600,7 +600,7 @@
         <w:rPr>
           <w:rtl w:val="0"/>
         </w:rPr>
-        <w:t xml:space="preserve">Auch mit OpenMP wird ein Speedup von nahezu 10x erreicht. Die Kombination aus Vektorisierung (SIMD) und Thread-basiertem Parallelismus zeigt, dass beide Technologien gut zusammenspielen. OpenMP bietet dabei eine einfache Möglichkeit, parallele Schleifen zu schreiben, während die Vc-Bibliothek effizient die SIMD-Instruktionen nutzt.</w:t>
+        <w:t xml:space="preserve">Auch mit OpenMP wird ein Speedup von nahezu 10x erreicht. Die Kombination aus Vektorisierung (SIMD) und Thread-basiertem Parallelismus zeigt, dass beide Technologien gut zusammenspielen. OpenMP bietet dabei eine einfache Möglichkeit, parallele Schleifen zu schreiben.</w:t>
       </w:r>
     </w:p>
     <w:p>
@@ -1065,7 +1065,7 @@
           <w:szCs w:val="24"/>
           <w:rtl w:val="0"/>
         </w:rPr>
-        <w:t xml:space="preserve">Der </w:t>
+        <w:t xml:space="preserve">Die Sperrung mit </w:t>
       </w:r>
       <w:r>
         <w:rPr>
@@ -1074,6 +1074,57 @@
           <w:szCs w:val="24"/>
           <w:rtl w:val="0"/>
         </w:rPr>
+        <w:t xml:space="preserve">spin_mutex::scoped_lock</w:t>
+      </w:r>
+      <w:r>
+        <w:rPr>
+          <w:sz w:val="24"/>
+          <w:szCs w:val="24"/>
+          <w:rtl w:val="0"/>
+        </w:rPr>
+        <w:t xml:space="preserve"> durch </w:t>
+      </w:r>
+      <w:r>
+        <w:rPr>
+          <w:rFonts w:ascii="Roboto Mono" w:cs="Roboto Mono" w:eastAsia="Roboto Mono" w:hAnsi="Roboto Mono"/>
+          <w:sz w:val="24"/>
+          <w:szCs w:val="24"/>
+          <w:rtl w:val="0"/>
+        </w:rPr>
+        <w:t xml:space="preserve">lock </w:t>
+      </w:r>
+      <w:r>
+        <w:rPr>
+          <w:sz w:val="24"/>
+          <w:szCs w:val="24"/>
+          <w:rtl w:val="0"/>
+        </w:rPr>
+        <w:t xml:space="preserve">blockiert andere Threads so lange, bis (der aktuelle Thread den Zähler fertig erhöht hat und) man aus dem Scope rauskommt, in dem gesperrt wurde. Das Warten passiert dabei aktiv (busy waiting), was bei sehr kurzen Abschnitten wie hier oft schneller ist als ein normaler mutex, bei dem der Thread schlafen gelegt und später neu gestartet werden müsste.</w:t>
+      </w:r>
+    </w:p>
+    <w:p>
+      <w:pPr>
+        <w:spacing w:line="278.00000000000006" w:lineRule="auto"/>
+        <w:rPr>
+          <w:sz w:val="24"/>
+          <w:szCs w:val="24"/>
+        </w:rPr>
+      </w:pPr>
+      <w:r>
+        <w:rPr>
+          <w:sz w:val="24"/>
+          <w:szCs w:val="24"/>
+          <w:rtl w:val="0"/>
+        </w:rPr>
+        <w:t xml:space="preserve">Damit man den </w:t>
+      </w:r>
+      <w:r>
+        <w:rPr>
+          <w:rFonts w:ascii="Roboto Mono" w:cs="Roboto Mono" w:eastAsia="Roboto Mono" w:hAnsi="Roboto Mono"/>
+          <w:sz w:val="24"/>
+          <w:szCs w:val="24"/>
+          <w:rtl w:val="0"/>
+        </w:rPr>
         <w:t xml:space="preserve">spin_mutex</w:t>
       </w:r>
       <w:r>
@@ -1082,24 +1133,7 @@
           <w:szCs w:val="24"/>
           <w:rtl w:val="0"/>
         </w:rPr>
-        <w:t xml:space="preserve"> blockiert andere Threads so lange, bis der aktuelle Thread den Zähler fertig erhöht hat. Das Warten passiert dabei aktiv (busy waiting), was bei sehr kurzen Abschnitten wie hier oft schneller ist als ein normaler mutex, bei dem der Thread schlafen gelegt und später neu gestartet werden müsste.</w:t>
-      </w:r>
-    </w:p>
-    <w:p>
-      <w:pPr>
-        <w:spacing w:line="278.00000000000006" w:lineRule="auto"/>
-        <w:rPr>
-          <w:sz w:val="24"/>
-          <w:szCs w:val="24"/>
-        </w:rPr>
-      </w:pPr>
-      <w:r>
-        <w:rPr>
-          <w:sz w:val="24"/>
-          <w:szCs w:val="24"/>
-          <w:rtl w:val="0"/>
-        </w:rPr>
-        <w:t xml:space="preserve">Damit man den </w:t>
+        <w:t xml:space="preserve"> nicht jedes Mal manuell wieder freigeben muss, verwendet man den </w:t>
       </w:r>
       <w:r>
         <w:rPr>
@@ -1108,23 +1142,6 @@
           <w:szCs w:val="24"/>
           <w:rtl w:val="0"/>
         </w:rPr>
-        <w:t xml:space="preserve">spin_mutex</w:t>
-      </w:r>
-      <w:r>
-        <w:rPr>
-          <w:sz w:val="24"/>
-          <w:szCs w:val="24"/>
-          <w:rtl w:val="0"/>
-        </w:rPr>
-        <w:t xml:space="preserve"> nicht jedes Mal manuell wieder freigeben muss, verwendet man den </w:t>
-      </w:r>
-      <w:r>
-        <w:rPr>
-          <w:rFonts w:ascii="Roboto Mono" w:cs="Roboto Mono" w:eastAsia="Roboto Mono" w:hAnsi="Roboto Mono"/>
-          <w:sz w:val="24"/>
-          <w:szCs w:val="24"/>
-          <w:rtl w:val="0"/>
-        </w:rPr>
         <w:t xml:space="preserve">scoped_lock</w:t>
       </w:r>
       <w:r>
@@ -1133,7 +1150,7 @@
           <w:szCs w:val="24"/>
           <w:rtl w:val="0"/>
         </w:rPr>
-        <w:t xml:space="preserve">. Dieser sperrt automatisch beim Betreten des Blocks und gibt den Lock wieder frei, wenn der Block verlassen wird. Man braucht also kein </w:t>
+        <w:t xml:space="preserve">. Dieser sperrt automatisch beim Betreten des Scopes und gibt den Lock wieder frei, wenn der Scope verlassen wird. Man braucht also kein </w:t>
       </w:r>
       <w:r>
         <w:rPr>

</xml_diff>